<commit_message>
Sửa bảng phí mẫu Chuyên nghiệp lệch cột, dấu cách nhãn, chiết khấu 0, chuẩn hóa tên gian hàng
Co-Authored-By: Claude Opus 5.5 <noreply@anthropic.com>
Claude-Session: https://claude.ai/code/session_01CsMP1aGgLuJ1aQXsTEzKgG
</commit_message>
<xml_diff>
--- a/data/hopdong-chuyennghiep.docx
+++ b/data/hopdong-chuyennghiep.docx
@@ -907,7 +907,7 @@
           <w:color w:val="000000"/>
           <w:rtl w:val="0"/>
         </w:rPr>
-        <w:t xml:space="preserve">Ngày sinh: {{NGAY_SINH}} Chức vụ:{{CHUC_VU_BEN_B}}</w:t>
+        <w:t xml:space="preserve">Ngày sinh: {{NGAY_SINH}} Chức vụ: {{CHUC_VU_BEN_B}}</w:t>
       </w:r>
     </w:p>
     <w:p>
@@ -925,7 +925,7 @@
           <w:color w:val="000000"/>
           <w:rtl w:val="0"/>
         </w:rPr>
-        <w:t xml:space="preserve">Địa chỉ cửa hàng:{{DIA_CHI}}</w:t>
+        <w:t xml:space="preserve">Địa chỉ cửa hàng: {{DIA_CHI}}</w:t>
       </w:r>
     </w:p>
     <w:p>
@@ -1808,7 +1808,7 @@
                 <w:color w:val="000000"/>
                 <w:rtl w:val="0"/>
               </w:rPr>
-              <w:t xml:space="preserve">{{SO_KHO}}</w:t>
+              <w:t xml:space="preserve">{{THOI_HAN_THANG}}</w:t>
             </w:r>
           </w:p>
         </w:tc>
@@ -1840,7 +1840,7 @@
                 <w:color w:val="000000"/>
                 <w:rtl w:val="0"/>
               </w:rPr>
-              <w:t xml:space="preserve">{{THOI_HAN_THANG}}</w:t>
+              <w:t xml:space="preserve">{{PHI_GOC}}</w:t>
             </w:r>
           </w:p>
         </w:tc>
@@ -1913,7 +1913,7 @@
                 <w:color w:val="000000"/>
                 <w:rtl w:val="0"/>
               </w:rPr>
-              <w:t xml:space="preserve">{{PHI_GOC}}</w:t>
+              <w:t xml:space="preserve">{{SO_KHO}}</w:t>
             </w:r>
           </w:p>
         </w:tc>
@@ -2209,7 +2209,7 @@
                 <w:color w:val="000000"/>
                 <w:rtl w:val="0"/>
               </w:rPr>
-              <w:t xml:space="preserve">{{CHIET_KHAU}}VNĐ</w:t>
+              <w:t xml:space="preserve">{{CHIET_KHAU}} VNĐ</w:t>
             </w:r>
           </w:p>
         </w:tc>
@@ -2305,7 +2305,7 @@
                 <w:color w:val="000000"/>
                 <w:rtl w:val="0"/>
               </w:rPr>
-              <w:t xml:space="preserve">{{TONG_CONG}}VNĐ</w:t>
+              <w:t xml:space="preserve">{{TONG_CONG}} VNĐ</w:t>
             </w:r>
           </w:p>
         </w:tc>

</xml_diff>

<commit_message>
Thêm hợp đồng Gói Cơ bản, bỏ căn cứ Luật CNTT 67/2006/QH11 ở 3 gói còn lại
- Thêm data/hopdong-coban.docx (mẫu mới, đã gắn token {{...}}) và nối
  gói Cơ bản vào GOI_CONFIG, DEFAULT_TEMPLATE_URLS, mã số hợp đồng (CB),
  dropdown "Loại văn bản" trong form hợp đồng
- Gỡ gạch đầu dòng "Căn cứ Luật Công nghệ Thông tin số 67/2006/QH11..."
  khỏi phần căn cứ pháp lý của 3 mẫu: hopdong-chuyennghiep.docx,
  hopdong-hotro.docx, hopdong-caocap.docx — theo bản cập nhật mới nhất
  từ phía công ty; không có thay đổi nội dung nào khác, số trang giữ
  nguyên (5/5/6 trang) sau khi kiểm tra

Co-Authored-By: Claude Sonnet 5 <noreply@anthropic.com>
Claude-Session: https://claude.ai/code/session_0191NmhqpBMsjFaWGm1i9967
</commit_message>
<xml_diff>
--- a/data/hopdong-chuyennghiep.docx
+++ b/data/hopdong-chuyennghiep.docx
@@ -328,33 +328,6 @@
           <w:rtl w:val="0"/>
         </w:rPr>
         <w:t xml:space="preserve">Căn cứ Luật Thương mại số 36/2005/QH11 của Quốc hội nước Cộng hòa xã hội chủ nghĩa Việt Nam thông qua ngày 14/06/2005 và các văn bản hướng dẫn thi hành;</w:t>
-      </w:r>
-    </w:p>
-    <w:p>
-      <w:pPr>
-        <w:numPr>
-          <w:ilvl w:val="0"/>
-          <w:numId w:val="7"/>
-        </w:numPr>
-        <w:tabs>
-          <w:tab w:val="left" w:leader="none" w:pos="360"/>
-        </w:tabs>
-        <w:spacing w:after="60" w:before="120" w:line="276" w:lineRule="auto"/>
-        <w:ind w:left="360" w:hanging="357"/>
-        <w:rPr>
-          <w:i w:val="1"/>
-          <w:iCs w:val="1"/>
-          <w:color w:val="000000"/>
-        </w:rPr>
-      </w:pPr>
-      <w:r>
-        <w:rPr>
-          <w:i w:val="1"/>
-          <w:iCs w:val="1"/>
-          <w:color w:val="000000"/>
-          <w:rtl w:val="0"/>
-        </w:rPr>
-        <w:t xml:space="preserve">Căn cứ Luật Công nghệ Thông tin số 67/2006/QH11 của Quốc hội nước Cộng hòa xã hội chủ nghĩa Việt Nam thông qua ngày 29/06/2006 và các văn bản hướng dẫn thi hành;</w:t>
       </w:r>
     </w:p>
     <w:p>

</xml_diff>